<commit_message>
Revise thesis methods per supervisor feedback
</commit_message>
<xml_diff>
--- a/current-study/outputs/Master_Thesis_Digital_Badges_Thai_IT_Students.docx
+++ b/current-study/outputs/Master_Thesis_Digital_Badges_Thai_IT_Students.docx
@@ -134,7 +134,7 @@
     <w:p>
       <w:pPr/>
       <w:r>
-        <w:t>University-issued digital badges provide students with a portable way to present learning achievements from IT micro-credentials in job applications. Their value depends partly on whether students regard them as useful and intend to use them. This proposed study examines four published relationships explaining Thai IT students' behavioural intention to use university-issued digital badges in job applications. The conceptual framework draws on the Technology Acceptance Model, Technology Acceptance Model 3, research on technology use for micro-credential programmes, and the digital-badge framework tested by Steenkamp, Fisher, and Nesbit (2024). The framework contains five constructs: Perceived Ease of Use, Job Application Relevance, Perceived Usefulness, Subjective Norm, and Behavioural Intention to Use DB. A quantitative cross-sectional questionnaire survey will be conducted with students aged 18 years or older who are enrolled in IT-related university programmes in Thailand. The questionnaire contains 18 seven-point Likert-scale items taken from Steenkamp et al. (2024). After a pilot test with 40 eligible students, at least 384 usable responses will be collected and analysed using partial least squares structural equation modelling. The study is intended to identify the beliefs most closely associated with students' intended use of digital badges and to inform university micro-credential and career-support practices.</w:t>
+        <w:t>University-issued digital badges provide students with a portable way to present learning achievements from IT micro-credentials in job applications. Their value depends partly on whether students regard them as useful and intend to use them. This proposed study examines four published relationships explaining Thai IT students' behavioural intention to use university-issued digital badges in job applications. The conceptual framework draws on the Technology Acceptance Model, Technology Acceptance Model 3, research on technology use for micro-credential programmes, and the digital-badge framework tested by Steenkamp, Fisher, and Nesbit (2024). The framework contains five constructs: Perceived Ease of Use, Job Application Relevance, Perceived Usefulness, Subjective Norm, and Behavioural Intention to Use DB. A quantitative cross-sectional questionnaire survey will be conducted with students aged 18 years or older who are enrolled in IT-related university programmes in Thailand. The questionnaire retains 18 measurement statements from Steenkamp et al. (2024) and uses a five-point Likert agreement scale. After a pilot test with 40 eligible students, at least 384 usable responses will be collected. Data will be analysed using descriptive statistics, Cronbach's alpha, collinearity diagnostics, and two multiple linear regression models. The study is intended to identify the beliefs most closely associated with students' intended use of digital badges and to inform university micro-credential and career-support practices.</w:t>
       </w:r>
     </w:p>
     <w:p>
@@ -463,7 +463,7 @@
     </w:p>
     <w:p>
       <w:r>
-        <w:t>The study focuses on students aged 18 years or older who are enrolled in undergraduate or postgraduate IT-related programmes at universities in Thailand. The focal object is a university-issued digital badge representing successful completion of an IT micro-credential and capable of being presented in a job application. The model contains five constructs and four hypothesised relationships. Data will be collected using an 18-item, seven-point Likert-scale online questionnaire, followed by PLS-SEM analysis. The study concerns students' perceptions and intended use; it does not measure employers' evaluations, actual employment outcomes, or actual badge use.</w:t>
+        <w:t>The study focuses on students aged 18 years or older who are enrolled in undergraduate or postgraduate IT-related programmes at universities in Thailand. The focal object is a university-issued digital badge representing successful completion of an IT micro-credential and capable of being presented in a job application. The model contains five constructs and four hypothesised relationships. Data will be collected using an 18-item, five-point Likert-scale online questionnaire. Descriptive statistics, Cronbach's alpha, variance inflation factors, and two multiple linear regression models will be used for analysis. The study concerns students' perceptions and intended use; it does not measure employers' evaluations, actual employment outcomes, or actual badge use.</w:t>
       </w:r>
     </w:p>
     <w:p>
@@ -3681,7 +3681,7 @@
                 <w:b w:val="0"/>
                 <w:sz w:val="14"/>
               </w:rPr>
-              <w:t>7-point Likert</w:t>
+              <w:t>5-point Likert</w:t>
             </w:r>
           </w:p>
         </w:tc>
@@ -3824,7 +3824,7 @@
                 <w:b w:val="0"/>
                 <w:sz w:val="14"/>
               </w:rPr>
-              <w:t>7-point Likert</w:t>
+              <w:t>5-point Likert</w:t>
             </w:r>
           </w:p>
         </w:tc>
@@ -3964,7 +3964,7 @@
                 <w:b w:val="0"/>
                 <w:sz w:val="14"/>
               </w:rPr>
-              <w:t>7-point Likert</w:t>
+              <w:t>5-point Likert</w:t>
             </w:r>
           </w:p>
         </w:tc>
@@ -4107,7 +4107,7 @@
                 <w:b w:val="0"/>
                 <w:sz w:val="14"/>
               </w:rPr>
-              <w:t>7-point Likert</w:t>
+              <w:t>5-point Likert</w:t>
             </w:r>
           </w:p>
         </w:tc>
@@ -4248,7 +4248,7 @@
                 <w:b w:val="0"/>
                 <w:sz w:val="14"/>
               </w:rPr>
-              <w:t>7-point Likert</w:t>
+              <w:t>5-point Likert</w:t>
             </w:r>
           </w:p>
         </w:tc>
@@ -4391,7 +4391,7 @@
                 <w:b w:val="0"/>
                 <w:sz w:val="14"/>
               </w:rPr>
-              <w:t>7-point Likert</w:t>
+              <w:t>5-point Likert</w:t>
             </w:r>
           </w:p>
         </w:tc>
@@ -4531,7 +4531,7 @@
                 <w:b w:val="0"/>
                 <w:sz w:val="14"/>
               </w:rPr>
-              <w:t>7-point Likert</w:t>
+              <w:t>5-point Likert</w:t>
             </w:r>
           </w:p>
         </w:tc>
@@ -4674,7 +4674,7 @@
                 <w:b w:val="0"/>
                 <w:sz w:val="14"/>
               </w:rPr>
-              <w:t>7-point Likert</w:t>
+              <w:t>5-point Likert</w:t>
             </w:r>
           </w:p>
         </w:tc>
@@ -4815,7 +4815,7 @@
                 <w:b w:val="0"/>
                 <w:sz w:val="14"/>
               </w:rPr>
-              <w:t>7-point Likert</w:t>
+              <w:t>5-point Likert</w:t>
             </w:r>
           </w:p>
         </w:tc>
@@ -4958,7 +4958,7 @@
                 <w:b w:val="0"/>
                 <w:sz w:val="14"/>
               </w:rPr>
-              <w:t>7-point Likert</w:t>
+              <w:t>5-point Likert</w:t>
             </w:r>
           </w:p>
         </w:tc>
@@ -5098,7 +5098,7 @@
                 <w:b w:val="0"/>
                 <w:sz w:val="14"/>
               </w:rPr>
-              <w:t>7-point Likert</w:t>
+              <w:t>5-point Likert</w:t>
             </w:r>
           </w:p>
         </w:tc>
@@ -5241,7 +5241,7 @@
                 <w:b w:val="0"/>
                 <w:sz w:val="14"/>
               </w:rPr>
-              <w:t>7-point Likert</w:t>
+              <w:t>5-point Likert</w:t>
             </w:r>
           </w:p>
         </w:tc>
@@ -5382,7 +5382,7 @@
                 <w:b w:val="0"/>
                 <w:sz w:val="14"/>
               </w:rPr>
-              <w:t>7-point Likert</w:t>
+              <w:t>5-point Likert</w:t>
             </w:r>
           </w:p>
         </w:tc>
@@ -5525,7 +5525,7 @@
                 <w:b w:val="0"/>
                 <w:sz w:val="14"/>
               </w:rPr>
-              <w:t>7-point Likert</w:t>
+              <w:t>5-point Likert</w:t>
             </w:r>
           </w:p>
         </w:tc>
@@ -5665,7 +5665,7 @@
                 <w:b w:val="0"/>
                 <w:sz w:val="14"/>
               </w:rPr>
-              <w:t>7-point Likert</w:t>
+              <w:t>5-point Likert</w:t>
             </w:r>
           </w:p>
         </w:tc>
@@ -5809,7 +5809,7 @@
                 <w:b w:val="0"/>
                 <w:sz w:val="14"/>
               </w:rPr>
-              <w:t>7-point Likert</w:t>
+              <w:t>5-point Likert</w:t>
             </w:r>
           </w:p>
         </w:tc>
@@ -5949,7 +5949,7 @@
                 <w:b w:val="0"/>
                 <w:sz w:val="14"/>
               </w:rPr>
-              <w:t>7-point Likert</w:t>
+              <w:t>5-point Likert</w:t>
             </w:r>
           </w:p>
         </w:tc>
@@ -6092,7 +6092,7 @@
                 <w:b w:val="0"/>
                 <w:sz w:val="14"/>
               </w:rPr>
-              <w:t>7-point Likert</w:t>
+              <w:t>5-point Likert</w:t>
             </w:r>
           </w:p>
         </w:tc>
@@ -6167,7 +6167,7 @@
     </w:p>
     <w:p>
       <w:r>
-        <w:t>The study will use a quantitative, explanatory, cross-sectional survey design. This design is appropriate for measuring student perceptions and estimating the four hypothesised relationships at one point in time. The five constructs will be measured reflectively, consistent with Steenkamp et al. (2024), and the measurement and structural models will be assessed using PLS-SEM. The design can identify associations and predictive relationships but cannot establish causal effects.</w:t>
+        <w:t>The study will use a quantitative, explanatory, cross-sectional survey design. This design is appropriate for measuring student perceptions and estimating the four hypothesised relationships at one point in time. The five constructs will be measured using the published multi-item statements selected from Steenkamp et al. (2024). Construct scores will be formed after internal-consistency testing, and the four hypotheses will be examined using two multiple linear regression models. The design can identify associations and predictive relationships but cannot establish causal effects.</w:t>
       </w:r>
     </w:p>
     <w:p>
@@ -6201,7 +6201,7 @@
     </w:p>
     <w:p>
       <w:r>
-        <w:t>Convenience and snowball sampling will be used because a complete national sampling frame of Thai IT students is not available. The questionnaire will be distributed through university programmes, student groups, and academic networks. The Krejcie and Morgan (1970) table provides 384 as a conventional benchmark for a large population under probability-sampling assumptions. The present non-probability sample cannot claim the corresponding margin of error, but 384 is retained as a conservative minimum and exceeds the sample normally required for this five-construct PLS-SEM model (Hair et al., 2022). The recruitment target will be 400 usable responses.</w:t>
+        <w:t>Convenience and snowball sampling will be used because a complete national sampling frame of Thai IT students is not available. The questionnaire will be distributed through university programmes, student groups, and academic networks. The Krejcie and Morgan (1970) table provides 384 as a conventional benchmark for a large population under probability-sampling assumptions. The present non-probability sample cannot claim the corresponding margin of error, but 384 is retained as a conservative minimum for the descriptive and regression analyses. The recruitment target will be 400 usable responses to allow for incomplete or ineligible records.</w:t>
       </w:r>
     </w:p>
     <w:p>
@@ -6693,7 +6693,7 @@
                 <w:b w:val="0"/>
                 <w:sz w:val="17"/>
               </w:rPr>
-              <w:t>Test the measurement and structural models</w:t>
+              <w:t>Assess reliability and test the hypotheses</w:t>
             </w:r>
           </w:p>
         </w:tc>
@@ -6706,7 +6706,7 @@
     </w:p>
     <w:p>
       <w:r>
-        <w:t>All construct items will use the seven-point agreement scale employed by Steenkamp et al. (2024), ranging from 1 (strongly disagree) to 7 (strongly agree). The complete English measurement instrument is presented below.</w:t>
+        <w:t>Steenkamp et al. (2024) administered the source statements with seven response categories. The present study retains the 18 measurement statements but uses a five-point Likert agreement scale ranging from 1 (strongly disagree) to 5 (strongly agree). This is a documented response-format adaptation; the construct definitions, item assignments, and item wording remain unchanged except for the disclosed BI3 grammatical correction. Five- and seven-point formats are both established options for Likert-type measurement (Dawes, 2008). The complete English instrument is presented below.</w:t>
       </w:r>
     </w:p>
     <w:p>
@@ -6720,7 +6720,7 @@
           <w:b/>
           <w:sz w:val="21"/>
         </w:rPr>
-        <w:t>Table 4.2: Seven-point agreement scale</w:t>
+        <w:t>Table 4.2: Five-point agreement scale</w:t>
       </w:r>
     </w:p>
     <w:tbl>
@@ -6733,13 +6733,11 @@
         <w:tblInd w:w="120" w:type="dxa"/>
       </w:tblPr>
       <w:tblGrid>
-        <w:gridCol w:w="1275"/>
-        <w:gridCol w:w="1275"/>
-        <w:gridCol w:w="1275"/>
-        <w:gridCol w:w="1275"/>
-        <w:gridCol w:w="1275"/>
-        <w:gridCol w:w="1275"/>
-        <w:gridCol w:w="1278"/>
+        <w:gridCol w:w="1786"/>
+        <w:gridCol w:w="1786"/>
+        <w:gridCol w:w="1786"/>
+        <w:gridCol w:w="1786"/>
+        <w:gridCol w:w="1786"/>
       </w:tblGrid>
       <w:tr>
         <w:trPr>
@@ -6748,7 +6746,7 @@
         </w:trPr>
         <w:tc>
           <w:tcPr>
-            <w:tcW w:type="dxa" w:w="1275"/>
+            <w:tcW w:type="dxa" w:w="1786"/>
             <w:vAlign w:val="center"/>
             <w:tcMar>
               <w:top w:w="70" w:type="dxa"/>
@@ -6768,7 +6766,7 @@
               <w:rPr>
                 <w:rFonts w:ascii="Times New Roman" w:hAnsi="Times New Roman" w:eastAsia="Times New Roman"/>
                 <w:b/>
-                <w:sz w:val="14"/>
+                <w:sz w:val="16"/>
               </w:rPr>
               <w:t>1</w:t>
             </w:r>
@@ -6776,7 +6774,7 @@
         </w:tc>
         <w:tc>
           <w:tcPr>
-            <w:tcW w:type="dxa" w:w="1275"/>
+            <w:tcW w:type="dxa" w:w="1786"/>
             <w:vAlign w:val="center"/>
             <w:tcMar>
               <w:top w:w="70" w:type="dxa"/>
@@ -6796,7 +6794,7 @@
               <w:rPr>
                 <w:rFonts w:ascii="Times New Roman" w:hAnsi="Times New Roman" w:eastAsia="Times New Roman"/>
                 <w:b/>
-                <w:sz w:val="14"/>
+                <w:sz w:val="16"/>
               </w:rPr>
               <w:t>2</w:t>
             </w:r>
@@ -6804,7 +6802,7 @@
         </w:tc>
         <w:tc>
           <w:tcPr>
-            <w:tcW w:type="dxa" w:w="1275"/>
+            <w:tcW w:type="dxa" w:w="1786"/>
             <w:vAlign w:val="center"/>
             <w:tcMar>
               <w:top w:w="70" w:type="dxa"/>
@@ -6824,7 +6822,7 @@
               <w:rPr>
                 <w:rFonts w:ascii="Times New Roman" w:hAnsi="Times New Roman" w:eastAsia="Times New Roman"/>
                 <w:b/>
-                <w:sz w:val="14"/>
+                <w:sz w:val="16"/>
               </w:rPr>
               <w:t>3</w:t>
             </w:r>
@@ -6832,7 +6830,7 @@
         </w:tc>
         <w:tc>
           <w:tcPr>
-            <w:tcW w:type="dxa" w:w="1275"/>
+            <w:tcW w:type="dxa" w:w="1786"/>
             <w:vAlign w:val="center"/>
             <w:tcMar>
               <w:top w:w="70" w:type="dxa"/>
@@ -6852,7 +6850,7 @@
               <w:rPr>
                 <w:rFonts w:ascii="Times New Roman" w:hAnsi="Times New Roman" w:eastAsia="Times New Roman"/>
                 <w:b/>
-                <w:sz w:val="14"/>
+                <w:sz w:val="16"/>
               </w:rPr>
               <w:t>4</w:t>
             </w:r>
@@ -6860,7 +6858,7 @@
         </w:tc>
         <w:tc>
           <w:tcPr>
-            <w:tcW w:type="dxa" w:w="1275"/>
+            <w:tcW w:type="dxa" w:w="1786"/>
             <w:vAlign w:val="center"/>
             <w:tcMar>
               <w:top w:w="70" w:type="dxa"/>
@@ -6880,65 +6878,9 @@
               <w:rPr>
                 <w:rFonts w:ascii="Times New Roman" w:hAnsi="Times New Roman" w:eastAsia="Times New Roman"/>
                 <w:b/>
-                <w:sz w:val="14"/>
+                <w:sz w:val="16"/>
               </w:rPr>
               <w:t>5</w:t>
-            </w:r>
-          </w:p>
-        </w:tc>
-        <w:tc>
-          <w:tcPr>
-            <w:tcW w:type="dxa" w:w="1275"/>
-            <w:vAlign w:val="center"/>
-            <w:tcMar>
-              <w:top w:w="70" w:type="dxa"/>
-              <w:start w:w="80" w:type="dxa"/>
-              <w:bottom w:w="70" w:type="dxa"/>
-              <w:end w:w="80" w:type="dxa"/>
-            </w:tcMar>
-            <w:shd w:fill="D9E2F3"/>
-          </w:tcPr>
-          <w:p>
-            <w:pPr>
-              <w:spacing w:line="240" w:lineRule="auto" w:after="0"/>
-              <w:ind w:firstLine="0" w:left="0" w:right="0"/>
-              <w:jc w:val="center"/>
-            </w:pPr>
-            <w:r>
-              <w:rPr>
-                <w:rFonts w:ascii="Times New Roman" w:hAnsi="Times New Roman" w:eastAsia="Times New Roman"/>
-                <w:b/>
-                <w:sz w:val="14"/>
-              </w:rPr>
-              <w:t>6</w:t>
-            </w:r>
-          </w:p>
-        </w:tc>
-        <w:tc>
-          <w:tcPr>
-            <w:tcW w:type="dxa" w:w="1278"/>
-            <w:vAlign w:val="center"/>
-            <w:tcMar>
-              <w:top w:w="70" w:type="dxa"/>
-              <w:start w:w="80" w:type="dxa"/>
-              <w:bottom w:w="70" w:type="dxa"/>
-              <w:end w:w="80" w:type="dxa"/>
-            </w:tcMar>
-            <w:shd w:fill="D9E2F3"/>
-          </w:tcPr>
-          <w:p>
-            <w:pPr>
-              <w:spacing w:line="240" w:lineRule="auto" w:after="0"/>
-              <w:ind w:firstLine="0" w:left="0" w:right="0"/>
-              <w:jc w:val="center"/>
-            </w:pPr>
-            <w:r>
-              <w:rPr>
-                <w:rFonts w:ascii="Times New Roman" w:hAnsi="Times New Roman" w:eastAsia="Times New Roman"/>
-                <w:b/>
-                <w:sz w:val="14"/>
-              </w:rPr>
-              <w:t>7</w:t>
             </w:r>
           </w:p>
         </w:tc>
@@ -6949,7 +6891,7 @@
         </w:trPr>
         <w:tc>
           <w:tcPr>
-            <w:tcW w:type="dxa" w:w="1275"/>
+            <w:tcW w:type="dxa" w:w="1786"/>
             <w:vAlign w:val="center"/>
             <w:tcMar>
               <w:top w:w="70" w:type="dxa"/>
@@ -6968,7 +6910,7 @@
               <w:rPr>
                 <w:rFonts w:ascii="Times New Roman" w:hAnsi="Times New Roman" w:eastAsia="Times New Roman"/>
                 <w:b w:val="0"/>
-                <w:sz w:val="14"/>
+                <w:sz w:val="16"/>
               </w:rPr>
               <w:t>Strongly disagree</w:t>
             </w:r>
@@ -6976,7 +6918,7 @@
         </w:tc>
         <w:tc>
           <w:tcPr>
-            <w:tcW w:type="dxa" w:w="1275"/>
+            <w:tcW w:type="dxa" w:w="1786"/>
             <w:vAlign w:val="center"/>
             <w:tcMar>
               <w:top w:w="70" w:type="dxa"/>
@@ -6995,15 +6937,15 @@
               <w:rPr>
                 <w:rFonts w:ascii="Times New Roman" w:hAnsi="Times New Roman" w:eastAsia="Times New Roman"/>
                 <w:b w:val="0"/>
-                <w:sz w:val="14"/>
+                <w:sz w:val="16"/>
               </w:rPr>
-              <w:t>Moderately disagree</w:t>
+              <w:t>Disagree</w:t>
             </w:r>
           </w:p>
         </w:tc>
         <w:tc>
           <w:tcPr>
-            <w:tcW w:type="dxa" w:w="1275"/>
+            <w:tcW w:type="dxa" w:w="1786"/>
             <w:vAlign w:val="center"/>
             <w:tcMar>
               <w:top w:w="70" w:type="dxa"/>
@@ -7022,15 +6964,15 @@
               <w:rPr>
                 <w:rFonts w:ascii="Times New Roman" w:hAnsi="Times New Roman" w:eastAsia="Times New Roman"/>
                 <w:b w:val="0"/>
-                <w:sz w:val="14"/>
+                <w:sz w:val="16"/>
               </w:rPr>
-              <w:t>Somewhat disagree</w:t>
+              <w:t>Neutral</w:t>
             </w:r>
           </w:p>
         </w:tc>
         <w:tc>
           <w:tcPr>
-            <w:tcW w:type="dxa" w:w="1275"/>
+            <w:tcW w:type="dxa" w:w="1786"/>
             <w:vAlign w:val="center"/>
             <w:tcMar>
               <w:top w:w="70" w:type="dxa"/>
@@ -7049,15 +6991,15 @@
               <w:rPr>
                 <w:rFonts w:ascii="Times New Roman" w:hAnsi="Times New Roman" w:eastAsia="Times New Roman"/>
                 <w:b w:val="0"/>
-                <w:sz w:val="14"/>
+                <w:sz w:val="16"/>
               </w:rPr>
-              <w:t>Neutral</w:t>
+              <w:t>Agree</w:t>
             </w:r>
           </w:p>
         </w:tc>
         <w:tc>
           <w:tcPr>
-            <w:tcW w:type="dxa" w:w="1275"/>
+            <w:tcW w:type="dxa" w:w="1786"/>
             <w:vAlign w:val="center"/>
             <w:tcMar>
               <w:top w:w="70" w:type="dxa"/>
@@ -7076,61 +7018,7 @@
               <w:rPr>
                 <w:rFonts w:ascii="Times New Roman" w:hAnsi="Times New Roman" w:eastAsia="Times New Roman"/>
                 <w:b w:val="0"/>
-                <w:sz w:val="14"/>
-              </w:rPr>
-              <w:t>Somewhat agree</w:t>
-            </w:r>
-          </w:p>
-        </w:tc>
-        <w:tc>
-          <w:tcPr>
-            <w:tcW w:type="dxa" w:w="1275"/>
-            <w:vAlign w:val="center"/>
-            <w:tcMar>
-              <w:top w:w="70" w:type="dxa"/>
-              <w:start w:w="80" w:type="dxa"/>
-              <w:bottom w:w="70" w:type="dxa"/>
-              <w:end w:w="80" w:type="dxa"/>
-            </w:tcMar>
-          </w:tcPr>
-          <w:p>
-            <w:pPr>
-              <w:spacing w:line="240" w:lineRule="auto" w:after="0"/>
-              <w:ind w:firstLine="0" w:left="0" w:right="0"/>
-              <w:jc w:val="left"/>
-            </w:pPr>
-            <w:r>
-              <w:rPr>
-                <w:rFonts w:ascii="Times New Roman" w:hAnsi="Times New Roman" w:eastAsia="Times New Roman"/>
-                <w:b w:val="0"/>
-                <w:sz w:val="14"/>
-              </w:rPr>
-              <w:t>Moderately agree</w:t>
-            </w:r>
-          </w:p>
-        </w:tc>
-        <w:tc>
-          <w:tcPr>
-            <w:tcW w:type="dxa" w:w="1278"/>
-            <w:vAlign w:val="center"/>
-            <w:tcMar>
-              <w:top w:w="70" w:type="dxa"/>
-              <w:start w:w="80" w:type="dxa"/>
-              <w:bottom w:w="70" w:type="dxa"/>
-              <w:end w:w="80" w:type="dxa"/>
-            </w:tcMar>
-          </w:tcPr>
-          <w:p>
-            <w:pPr>
-              <w:spacing w:line="240" w:lineRule="auto" w:after="0"/>
-              <w:ind w:firstLine="0" w:left="0" w:right="0"/>
-              <w:jc w:val="left"/>
-            </w:pPr>
-            <w:r>
-              <w:rPr>
-                <w:rFonts w:ascii="Times New Roman" w:hAnsi="Times New Roman" w:eastAsia="Times New Roman"/>
-                <w:b w:val="0"/>
-                <w:sz w:val="14"/>
+                <w:sz w:val="16"/>
               </w:rPr>
               <w:t>Strongly agree</w:t>
             </w:r>
@@ -9410,75 +9298,18 @@
       </w:r>
     </w:p>
     <w:p>
-      <w:pPr>
-        <w:spacing w:after="40"/>
-        <w:numPr>
-          <w:ilvl w:val="0"/>
-          <w:numId w:val="12"/>
-        </w:numPr>
-      </w:pPr>
       <w:r>
-        <w:t>Screen records for consent, eligibility, duplicate submissions, missing data, completion quality, and coding errors.</w:t>
+        <w:t>After data collection, records will be screened for consent, eligibility, duplicate submissions, missing data, completion quality, and coding errors. Statistical analyses will be conducted using jamovi. Frequencies and percentages will describe respondent demographics and prior digital-badge experience. The mean and standard deviation will be reported for every measurement item. After the reliability assessment, a composite score for each construct will be calculated as the mean of its assigned items.</w:t>
       </w:r>
     </w:p>
     <w:p>
-      <w:pPr>
-        <w:spacing w:after="40"/>
-        <w:numPr>
-          <w:ilvl w:val="0"/>
-          <w:numId w:val="12"/>
-        </w:numPr>
-      </w:pPr>
       <w:r>
-        <w:t>Describe respondent characteristics using frequencies and percentages and summarize item and construct responses using means and standard deviations.</w:t>
+        <w:t>Internal consistency will be assessed separately for Perceived Ease of Use, Job Application Relevance, Perceived Usefulness, Subjective Norm, and Behavioural Intention to Use DB using Cronbach's alpha (Cronbach, 1951). Alpha values of .70 or higher will be treated as acceptable for the study, while item-total information and the theoretical coverage of each published scale will also be considered before any item is removed (Hair et al., 2019). Reliability will be reported for both the pilot sample and the final sample.</w:t>
       </w:r>
     </w:p>
     <w:p>
-      <w:pPr>
-        <w:spacing w:after="40"/>
-        <w:numPr>
-          <w:ilvl w:val="0"/>
-          <w:numId w:val="12"/>
-        </w:numPr>
-      </w:pPr>
       <w:r>
-        <w:t>Assess the reflective measurement model using indicator loadings, Cronbach's alpha, composite reliability, average variance extracted, and heterotrait-monotrait ratios.</w:t>
-      </w:r>
-    </w:p>
-    <w:p>
-      <w:pPr>
-        <w:spacing w:after="40"/>
-        <w:numPr>
-          <w:ilvl w:val="0"/>
-          <w:numId w:val="12"/>
-        </w:numPr>
-      </w:pPr>
-      <w:r>
-        <w:t>Assess structural-model collinearity using variance inflation factors and report R-squared values for Perceived Usefulness and Behavioural Intention to Use DB.</w:t>
-      </w:r>
-    </w:p>
-    <w:p>
-      <w:pPr>
-        <w:spacing w:after="40"/>
-        <w:numPr>
-          <w:ilvl w:val="0"/>
-          <w:numId w:val="12"/>
-        </w:numPr>
-      </w:pPr>
-      <w:r>
-        <w:t>Estimate H1-H4 in SmartPLS using 5,000 bootstrap samples and report path coefficients, confidence intervals, p-values, and effect sizes (Hair et al., 2022).</w:t>
-      </w:r>
-    </w:p>
-    <w:p>
-      <w:pPr>
-        <w:spacing w:after="40"/>
-        <w:numPr>
-          <w:ilvl w:val="0"/>
-          <w:numId w:val="12"/>
-        </w:numPr>
-      </w:pPr>
-      <w:r>
-        <w:t>Determine support for each hypothesis at the 5% significance level and compare the resulting pattern with Steenkamp et al. (2024) and the literature reviewed in Chapter 2.</w:t>
+        <w:t>Two multiple linear regression models will test the four hypotheses. In the first model, Perceived Usefulness will be the dependent variable, with Perceived Ease of Use and Job Application Relevance as independent variables; this model will test H1 and H2. In the second model, Behavioural Intention to Use DB will be the dependent variable, with Perceived Usefulness and Subjective Norm as independent variables; this model will test H3 and H4. Variance inflation factors will be examined for collinearity, and residual diagnostics will be reviewed for the assumptions of multiple linear regression (Hair et al., 2019). Each model will report R-squared, adjusted R-squared, the overall F-test, unstandardized and standardized coefficients, standard errors, t-values, p-values, and confidence intervals. A hypothesis will be supported when its coefficient is positive and its p-value is below .05.</w:t>
       </w:r>
     </w:p>
     <w:p>
@@ -9582,7 +9413,33 @@
         <w:rPr>
           <w:sz w:val="21"/>
         </w:rPr>
+        <w:t>Cronbach, L. J. (1951). Coefficient alpha and the internal structure of tests. Psychometrika, 16(3), 297-334. https://doi.org/10.1007/BF02310555</w:t>
+      </w:r>
+    </w:p>
+    <w:p>
+      <w:pPr>
+        <w:spacing w:line="240" w:lineRule="auto" w:after="60"/>
+        <w:ind w:hanging="432" w:left="432"/>
+        <w:jc w:val="left"/>
+      </w:pPr>
+      <w:r>
+        <w:rPr>
+          <w:sz w:val="21"/>
+        </w:rPr>
         <w:t>Davis, F. D. (1989). Perceived usefulness, perceived ease of use, and user acceptance of information technology. MIS Quarterly, 13(3), 319-340. https://doi.org/10.2307/249008</w:t>
+      </w:r>
+    </w:p>
+    <w:p>
+      <w:pPr>
+        <w:spacing w:line="240" w:lineRule="auto" w:after="60"/>
+        <w:ind w:hanging="432" w:left="432"/>
+        <w:jc w:val="left"/>
+      </w:pPr>
+      <w:r>
+        <w:rPr>
+          <w:sz w:val="21"/>
+        </w:rPr>
+        <w:t>Dawes, J. (2008). Do data characteristics change according to the number of scale points used? An experiment using 5-point, 7-point and 10-point scales. International Journal of Market Research, 50(1), 61-104. https://doi.org/10.1177/147078530805000106</w:t>
       </w:r>
     </w:p>
     <w:p>
@@ -9621,7 +9478,7 @@
         <w:rPr>
           <w:sz w:val="21"/>
         </w:rPr>
-        <w:t>Hair, J. F., Hult, G. T. M., Ringle, C. M., and Sarstedt, M. (2022). A primer on partial least squares structural equation modeling (PLS-SEM) (3rd ed.). Sage.</w:t>
+        <w:t>Hair, J. F., Black, W. C., Babin, B. J., and Anderson, R. E. (2019). Multivariate data analysis (8th ed.). Cengage.</w:t>
       </w:r>
     </w:p>
     <w:p>
@@ -10101,21 +9958,6 @@
   </w:abstractNum>
   <w:num w:numId="11">
     <w:abstractNumId w:val="10"/>
-  </w:num>
-  <w:abstractNum w:abstractNumId="11">
-    <w:multiLevelType w:val="singleLevel"/>
-    <w:lvl w:ilvl="0">
-      <w:start w:val="1"/>
-      <w:numFmt w:val="decimal"/>
-      <w:lvlText w:val="%1."/>
-      <w:lvlJc w:val="left"/>
-      <w:pPr>
-        <w:ind w:left="576" w:hanging="288"/>
-      </w:pPr>
-    </w:lvl>
-  </w:abstractNum>
-  <w:num w:numId="12">
-    <w:abstractNumId w:val="11"/>
   </w:num>
 </w:numbering>
 </file>

</xml_diff>

<commit_message>
Use English-only questionnaire administration
</commit_message>
<xml_diff>
--- a/current-study/outputs/Master_Thesis_Digital_Badges_Thai_IT_Students.docx
+++ b/current-study/outputs/Master_Thesis_Digital_Badges_Thai_IT_Students.docx
@@ -9268,12 +9268,12 @@
         <w:pStyle w:val="Heading2"/>
       </w:pPr>
       <w:r>
-        <w:t>4.4 Translation and Pilot Testing</w:t>
+        <w:t>4.4 Questionnaire Language and Pilot Testing</w:t>
       </w:r>
     </w:p>
     <w:p>
       <w:r>
-        <w:t>The approved English questionnaire will be translated into Thai and independently back-translated into English. Differences will be reconciled to preserve each construct's intended meaning (Brislin, 1970). Before the main survey, the Thai questionnaire will be pilot tested with 40 eligible Thai IT students, consistent with the programme examples and published pilot-study guidance (Hertzog, 2008; Johanson &amp; Brooks, 2010). The pilot will assess screening logic, instructions, item comprehension, completion time, missing responses, and preliminary internal consistency. Pilot participants will be excluded from the main study.</w:t>
+        <w:t>The questionnaire will be administered in English so that the 18 measurement statements retain the wording of the published English instrument in Steenkamp et al. (2024). Before the main survey, the English questionnaire will be pilot tested with 40 eligible Thai IT students, consistent with the programme examples and published pilot-study guidance (Hertzog, 2008; Johanson &amp; Brooks, 2010). The pilot will assess screening logic, instructions, item clarity and comprehension, completion time, missing responses, and preliminary internal consistency. Any comprehension problem identified in the pilot will be reviewed before main data collection. Pilot participants will be excluded from the main study.</w:t>
       </w:r>
     </w:p>
     <w:p>
@@ -9375,19 +9375,6 @@
           <w:sz w:val="21"/>
         </w:rPr>
         <w:t>Ajzen, I. (1991). The theory of planned behavior. Organizational Behavior and Human Decision Processes, 50(2), 179-211. https://doi.org/10.1016/0749-5978(91)90020-T</w:t>
-      </w:r>
-    </w:p>
-    <w:p>
-      <w:pPr>
-        <w:spacing w:line="240" w:lineRule="auto" w:after="60"/>
-        <w:ind w:hanging="432" w:left="432"/>
-        <w:jc w:val="left"/>
-      </w:pPr>
-      <w:r>
-        <w:rPr>
-          <w:sz w:val="21"/>
-        </w:rPr>
-        <w:t>Brislin, R. W. (1970). Back-translation for cross-cultural research. Journal of Cross-Cultural Psychology, 1(3), 185-216. https://doi.org/10.1177/135910457000100301</w:t>
       </w:r>
     </w:p>
     <w:p>

</xml_diff>

<commit_message>
Simplify pilot and response-screening method
</commit_message>
<xml_diff>
--- a/current-study/outputs/Master_Thesis_Digital_Badges_Thai_IT_Students.docx
+++ b/current-study/outputs/Master_Thesis_Digital_Badges_Thai_IT_Students.docx
@@ -6201,7 +6201,7 @@
     </w:p>
     <w:p>
       <w:r>
-        <w:t>Convenience and snowball sampling will be used because a complete national sampling frame of Thai IT students is not available. The questionnaire will be distributed through university programmes, student groups, and academic networks. The Krejcie and Morgan (1970) table provides 384 as a conventional benchmark for a large population under probability-sampling assumptions. The present non-probability sample cannot claim the corresponding margin of error, but 384 is retained as a conservative minimum for the descriptive and regression analyses. The recruitment target will be 400 usable responses to allow for incomplete or ineligible records.</w:t>
+        <w:t>Convenience and snowball sampling will be used because a complete national sampling frame of Thai IT students is not available. The questionnaire will be distributed through university programmes, student groups, and academic networks. The Krejcie and Morgan (1970) table provides 384 as a conventional benchmark for a large population under probability-sampling assumptions. The present non-probability sample cannot claim the corresponding margin of error, but 384 is retained as a conservative minimum for the descriptive and regression analyses. The study will seek 400 responses, with at least 384 usable responses required after eligibility screening.</w:t>
       </w:r>
     </w:p>
     <w:p>
@@ -6214,7 +6214,7 @@
     </w:p>
     <w:p>
       <w:r>
-        <w:t>Respondents will be included if they provide informed consent, are at least 18 years old, are currently enrolled in an IT-related university programme in Thailand, and complete the construct measures. Records will be excluded for failed eligibility screening, duplicate submission, substantial missing data, or implausibly short completion time. Pilot participants will not be included in the main-study dataset.</w:t>
+        <w:t>Only records from respondents who provide informed consent, pass the eligibility screening, and complete the construct measures will be included in the analysis. Pilot participants will not be included in the main-study dataset.</w:t>
       </w:r>
     </w:p>
     <w:p>
@@ -6402,7 +6402,7 @@
                 <w:b w:val="0"/>
                 <w:sz w:val="17"/>
               </w:rPr>
-              <w:t>Participant information, consent, age, enrolment status, and field</w:t>
+              <w:t>Participant information and informed consent</w:t>
             </w:r>
           </w:p>
         </w:tc>
@@ -6429,7 +6429,7 @@
                 <w:b w:val="0"/>
                 <w:sz w:val="17"/>
               </w:rPr>
-              <w:t>Confirm consent and eligibility</w:t>
+              <w:t>Confirm voluntary participation</w:t>
             </w:r>
           </w:p>
         </w:tc>
@@ -6490,7 +6490,7 @@
                 <w:b w:val="0"/>
                 <w:sz w:val="17"/>
               </w:rPr>
-              <w:t>Neutral definition of an IT micro-credential and university-issued digital badge</w:t>
+              <w:t>Age, university enrolment, and IT-related field screening</w:t>
             </w:r>
           </w:p>
         </w:tc>
@@ -6518,7 +6518,7 @@
                 <w:b w:val="0"/>
                 <w:sz w:val="17"/>
               </w:rPr>
-              <w:t>Provide a common referent</w:t>
+              <w:t>Confirm eligibility</w:t>
             </w:r>
           </w:p>
         </w:tc>
@@ -6577,7 +6577,7 @@
                 <w:b w:val="0"/>
                 <w:sz w:val="17"/>
               </w:rPr>
-              <w:t>Age group, gender, study level, field, year, institution type, and prior badge awareness or use</w:t>
+              <w:t>Demographic profile and prior badge awareness or use</w:t>
             </w:r>
           </w:p>
         </w:tc>
@@ -6665,7 +6665,7 @@
                 <w:b w:val="0"/>
                 <w:sz w:val="17"/>
               </w:rPr>
-              <w:t>Eighteen statements measuring five model constructs</w:t>
+              <w:t>Neutral definition followed by 18 statements measuring five constructs</w:t>
             </w:r>
           </w:p>
         </w:tc>
@@ -6693,7 +6693,7 @@
                 <w:b w:val="0"/>
                 <w:sz w:val="17"/>
               </w:rPr>
-              <w:t>Assess reliability and test the hypotheses</w:t>
+              <w:t>Provide a common referent and test the hypotheses</w:t>
             </w:r>
           </w:p>
         </w:tc>
@@ -9273,7 +9273,7 @@
     </w:p>
     <w:p>
       <w:r>
-        <w:t>The questionnaire will be administered in English so that the 18 measurement statements retain the wording of the published English instrument in Steenkamp et al. (2024). Before the main survey, the English questionnaire will be pilot tested with 40 eligible Thai IT students, consistent with the programme examples and published pilot-study guidance (Hertzog, 2008; Johanson &amp; Brooks, 2010). The pilot will assess screening logic, instructions, item clarity and comprehension, completion time, missing responses, and preliminary internal consistency. Any comprehension problem identified in the pilot will be reviewed before main data collection. Pilot participants will be excluded from the main study.</w:t>
+        <w:t>The questionnaire will be administered in English so that the 18 measurement statements retain the wording of the published English instrument in Steenkamp et al. (2024). Before the main survey, the English questionnaire will be pilot tested with 40 eligible Thai IT students, consistent with the programme examples and published pilot-study guidance (Hertzog, 2008; Johanson &amp; Brooks, 2010). The pilot will assess whether the instructions and measurement items are clear and understandable and will provide preliminary internal-consistency evidence. The pilot form will include short feedback questions about unclear wording; these questions will not form part of the construct analysis and will be removed from the main survey. Any problem identified in the pilot will be reviewed before main data collection. Pilot participants will be excluded from the main study.</w:t>
       </w:r>
     </w:p>
     <w:p>
@@ -9299,7 +9299,7 @@
     </w:p>
     <w:p>
       <w:r>
-        <w:t>After data collection, records will be screened for consent, eligibility, duplicate submissions, missing data, completion quality, and coding errors. Statistical analyses will be conducted using jamovi. Frequencies and percentages will describe respondent demographics and prior digital-badge experience. The mean and standard deviation will be reported for every measurement item. After the reliability assessment, a composite score for each construct will be calculated as the mean of its assigned items.</w:t>
+        <w:t>After data collection, records will be screened for consent, eligibility, and completion of the construct measures. Statistical analyses will be conducted using jamovi. Frequencies and percentages will describe respondent demographics and prior digital-badge experience. The mean and standard deviation will be reported for every measurement item. After the reliability assessment, a composite score for each construct will be calculated as the mean of its assigned items.</w:t>
       </w:r>
     </w:p>
     <w:p>

</xml_diff>